<commit_message>
Four state-definition refits, calendar-time extension, converged duration fit
Refits: long-term care at two ADLs, dementia counted as long-term care
(flag carried forward across the wave-16 gap in the cognition score),
waves 9-16 only, weighted likelihood. Extensions start from the fitted
main model and record convergence; the duration fit now converges with
unchanged estimates. Fixes the quadratic-age covariate, which used the
interval midpoint and so carried the death date, and the likelihood-ratio
degrees of freedom (18 per term, not 12).
</commit_message>
<xml_diff>
--- a/manuscript/Paper5_Babalola.docx
+++ b/manuscript/Paper5_Babalola.docx
@@ -59,7 +59,7 @@
         <w:t xml:space="preserve"> </w:t>
       </w:r>
       <w:r>
-        <w:t xml:space="preserve">7,110 excluding abstract, tables, figure captions and references.</w:t>
+        <w:t xml:space="preserve">7,589 excluding abstract, tables, figure captions and references.</w:t>
       </w:r>
     </w:p>
     <w:p>
@@ -3304,7 +3304,15 @@
         <w:t xml:space="preserve"> </w:t>
       </w:r>
       <w:r>
-        <w:t xml:space="preserve">One variant re-estimates the transition model rather than re-simulating it: folding nursing-home residence back into severe disability at home, which is the five-state definition this paper argues against. Because refits carry sex alone, the comparison is with the sex-only model. Pooling gives $36,104 and $44,809 with CVaR95 $199,397 and $247,942, against $35,760 and $45,178 with $191,226 and $246,060, and leaves the share ever in long-term care at 46% and 61%, as it must, since that share is the union of the two states either way. The case for separating them is therefore not that pooling moves the headline totals, which it does by about 1% in the mean and 4% in men’s tail, but that pooling hides where the money goes: a state with annual out-of-pocket cost of about $4,000 and one with about $18,000, with Medicaid covering a quarter of the first and two-fifths of the second, are not one state. Four further refits (long-term care at two or more ADLs, dementia counted as long-term care, waves 9 to 16 only, and a weighted likelihood) each need another re-estimation and were not run.</w:t>
+        <w:t xml:space="preserve">One variant re-estimates the transition model rather than re-simulating it: folding nursing-home residence back into severe disability at home, which is the five-state definition this paper argues against. Because refits carry sex alone, the comparison is with the sex-only model. Pooling gives $36,104 and $44,809 with CVaR95 $199,397 and $247,942, against $35,760 and $45,178 with $191,226 and $246,060, and leaves the share ever in long-term care at 46% and 61%, as it must, since that share is the union of the two states either way. The case for separating them is therefore not that pooling moves the headline totals, which it does by about 1% in the mean and 4% in men’s tail, but that pooling hides where the money goes: a state with annual out-of-pocket cost of about $4,000 and one with about $18,000, with Medicaid covering a quarter of the first and two-fifths of the second, are not one state.</w:t>
+      </w:r>
+    </w:p>
+    <w:p>
+      <w:pPr>
+        <w:pStyle w:val="BodyText"/>
+      </w:pPr>
+      <w:r>
+        <w:t xml:space="preserve">Four further refits change the definition of long-term-care need, the sample period or the likelihood. Lowering the threshold for long-term care to two ADL limitations raises the share of lives ever in long-term care from 47% and 61% to 58% and 71%, and counting dementia (a 27-point cognition score of 6 or less, or a reported diagnosis, carried forward once observed because the score is missing in 2022 and the diagnosis items begin in 2010) raises it to 57% and 69%. Neither moves the money much: out-of-pocket means of $35,599 and $44,382 at two ADLs and $35,489 and $45,302 with dementia, with CVaR95 of $191,305 and $240,045, and $188,082 and $251,586. A wider definition brings people with lighter needs into the state, so the share rises while the cost per person in it falls. Restricting estimation to waves 9 to 16 (2008 to 2022) lowers the tail to $183,424 and $232,429, 4% and 6% below the sex-only row, consistent with the declining disability and nursing-home entry the period extension in Section 6.9 finds. Weighting the likelihood by the respondent weights gives $35,274 and $44,275 with CVaR95 $187,408 and $240,359, within 2% of the unweighted means. Across the five refits, out-of-pocket means stay within 6% and CVaR95 within 6% of the sex-only model, against a Monte Carlo standard error of about $2,400 on CVaR95. The optimizer for the two-ADL refit stopped at its evaluation limit; restarting it from a different point and allowing four times as many iterations returned the same log likelihood (−170,892.7) and the same headline figures to within $20, so the reported values are at the maximum.</w:t>
       </w:r>
     </w:p>
     <w:bookmarkEnd w:id="48"/>
@@ -3322,7 +3330,7 @@
         <w:pStyle w:val="FirstParagraph"/>
       </w:pPr>
       <w:r>
-        <w:t xml:space="preserve">Table A1 reports extensions that add a term to every intensity of the full model and test it by likelihood ratio. Two have been estimated; each takes about three hours, and the other two (a quadratic in age, and a period effect) are not reported here.</w:t>
+        <w:t xml:space="preserve">Table A1 reports extensions that add a term to every one of the 18 intensities of the full model and test it by likelihood ratio. Each starts from the main model’s estimates with the new terms at zero, and the table records whether the optimizer converged.</w:t>
       </w:r>
     </w:p>
     <w:p>
@@ -3340,7 +3348,7 @@
         <w:t xml:space="preserve"> </w:t>
       </w:r>
       <w:r>
-        <w:t xml:space="preserve">Adding indicators for the lowest and highest tertile of household income improves the likelihood by 1,789.6 on 24 degrees of freedom. Low income raises the intensity of moving from H to D (hazard ratio 1.72), from C to D (1.43), from C to a nursing home (1.66) and from C to death (1.41); high income lowers the last two to 1.19 and 0.73. The effect on life expectancy is large: starting from chronic illness at 65, a man in the lowest tertile can expect 13.9 years and one in the highest 18.6, and a woman 17.5 against 22.2. The main model has no income term, so its income results in Section 6.5 carry differences in composition, costs and Medicaid but not in health dynamics, and the 2-year gap in life expectancy they show is less than half of the 4.7 years this extension implies.</w:t>
+        <w:t xml:space="preserve">Adding indicators for the lowest and highest tertile of household income improves the likelihood by 1,789.6 on 36 degrees of freedom. Low income raises the intensity of moving from H to D (hazard ratio 1.72), from C to D (1.43), from C to a nursing home (1.66) and from C to death (1.41); high income lowers the last two to 1.19 and 0.73. The effect on life expectancy is large: starting from chronic illness at 65, a man in the lowest tertile can expect 13.9 years and one in the highest 18.6, and a woman 17.5 against 22.2. The main model has no income term, so its income results in Section 6.5 carry differences in composition, costs and Medicaid but not in health dynamics, and the 2-year gap in life expectancy they show is less than half of the 4.7 years this extension implies.</w:t>
       </w:r>
     </w:p>
     <w:p>
@@ -3358,7 +3366,7 @@
         <w:t xml:space="preserve"> </w:t>
       </w:r>
       <w:r>
-        <w:t xml:space="preserve">Adding an indicator for having been in the same state at the previous interview, a coarse proxy for duration in state, improves the likelihood by 3,046.3 on 12 degrees of freedom, the largest improvement of any extension tried. Movements between live states are strongly duration-dependent in the expected direction: for someone already in the state two years earlier, the intensity of moving from C to D is 0.41 of the intensity for a recent entrant, from D back to C 0.48, from L to D 0.41 and from a nursing home back to D 0.22. Transitions happen soon after a change, and a Markov model spreads them evenly.</w:t>
+        <w:t xml:space="preserve">Adding an indicator for having been in the same state at the previous interview, a coarse proxy for duration in state, improves the likelihood by 3,046.3 on 18 degrees of freedom, the largest improvement of any extension tried. Movements between live states are strongly duration-dependent in the expected direction: for someone already in the state two years earlier, the intensity of moving from C to D is 0.41 of the intensity for a recent entrant, from D back to C 0.48, from L to D 0.41 and from a nursing home back to D 0.22. Transitions happen soon after a change, and a Markov model spreads them evenly.</w:t>
       </w:r>
     </w:p>
     <w:p>
@@ -3367,6 +3375,24 @@
       </w:pPr>
       <w:r>
         <w:t xml:space="preserve">Mortality is the exception, and it matters for Section 5. The death intensity from the nursing home is unchanged by the duration proxy (hazard ratio 1.03, interval 0.95 to 1.12), as is the death intensity from severe disability at home (1.00) and from disability (0.98). The model’s failure to fit deaths from the nursing home is therefore not duration dependence in mortality. The more likely explanation is unobserved heterogeneity: nursing-home residents differ in frailty in ways the six states and three covariates do not capture, so the observed group dies faster than a common hazard predicts. A frailty or semi-Markov specification is the next step, and it is a different model rather than another term in this one.</w:t>
+      </w:r>
+    </w:p>
+    <w:p>
+      <w:pPr>
+        <w:pStyle w:val="BodyText"/>
+      </w:pPr>
+      <w:r>
+        <w:rPr>
+          <w:b/>
+          <w:bCs/>
+        </w:rPr>
+        <w:t xml:space="preserve">Calendar time.</w:t>
+      </w:r>
+      <w:r>
+        <w:t xml:space="preserve"> </w:t>
+      </w:r>
+      <w:r>
+        <w:t xml:space="preserve">Adding a linear term in interview year, per decade from 2010, improves the likelihood by 354.8 on 18 degrees of freedom: far less than income or duration, but not negligible. The trend is toward less institutional care. Per decade, the intensity of entering a nursing home falls to 0.70 of its level from chronic illness, 0.70 from disability and 0.67 from severe disability at home, and the intensity of dying from chronic illness falls to 0.87. Recovery from disability to health also falls, to 0.50, and deaths from disability and from the nursing home become slightly more likely (1.13 and 1.07), consistent with people reaching those states later and in worse health. Starting from chronic illness at 65, life expectancy rises from 15.8 years in 1998 to 17.0 in 2022 for men and from 18.8 to 19.9 for women. The main model pools the period, so it describes the average of 1998 to 2022. Calibration to the 2023 life table corrects the level of mortality but not the decline in nursing-home entry, so for a cohort turning 65 now the model’s nursing-home use is, if anything, too high; the waves 9 to 16 refit in Section 6.8, with a tail 4% to 6% lower, points the same way.</w:t>
       </w:r>
     </w:p>
     <w:bookmarkEnd w:id="49"/>
@@ -3541,7 +3567,7 @@
         <w:t xml:space="preserve"> </w:t>
       </w:r>
       <w:r>
-        <w:t xml:space="preserve">Six matter most. First, the model is Markov in age and homogeneous within a state: movements between live states are strongly duration-dependent (Section 6.9), and deaths from the nursing home are underpredicted by an amount that duration does not explain, which points to frailty the model does not observe. Second, the MCBS Cost Supplement excludes facility, hospice and institutional events, so Medicare cost in the long-term-care states is understated even after scaling, and the Part A share omits skilled nursing. Third, out-of-pocket draws come from HRS self-reports, which are known to understate some categories and to be measured with error (Fahle, McGarry and Skinner, 2016); the comparison with published end-of-life estimates suggests the level here is low by roughly a third. Fourth, the spend-down rule ignores spousal protections, home equity, look-back rules and state variation, and the model has no spouse: every life is simulated alone. Fifth, there is no calendar trend in health or mortality, so calibration to a period table understates the longevity of a cohort turning 65 in 2026, and no trend in long-term-care prices. Sixth, the transition model has no income term, so the income results carry composition and costs but not differential health dynamics, which understates the gap between tertiles. Linked HRS-Medicare claims would address the second and third and are the natural next step.</w:t>
+        <w:t xml:space="preserve">Six matter most. First, the model is Markov in age and homogeneous within a state: movements between live states are strongly duration-dependent (Section 6.9), and deaths from the nursing home are underpredicted by an amount that duration does not explain, which points to frailty the model does not observe. Second, the MCBS Cost Supplement excludes facility, hospice and institutional events, so Medicare cost in the long-term-care states is understated even after scaling, and the Part A share omits skilled nursing. Third, out-of-pocket draws come from HRS self-reports, which are known to understate some categories and to be measured with error (Fahle, McGarry and Skinner, 2016); the comparison with published end-of-life estimates suggests the level here is low by roughly a third. Fourth, the spend-down rule ignores spousal protections, home equity, look-back rules and state variation, and the model has no spouse: every life is simulated alone. Fifth, the main model has no calendar trend: Section 6.9 finds nursing-home entry falling by about 30% a decade while life expectancy rises, so the pooled model overstates institutional use for a cohort turning 65 in 2026 while calibration to a period table understates its longevity, and there is no trend in long-term-care prices. Sixth, the main transition model has no income term; the extension in Section 6.9 shows that the income results of Section 6.5, which carry composition and costs but not differential health dynamics, understate the gap between tertiles. Linked HRS-Medicare claims would address the second and third and are the natural next step.</w:t>
       </w:r>
     </w:p>
     <w:bookmarkEnd w:id="51"/>
@@ -41027,6 +41053,682 @@
           </w:p>
         </w:tc>
       </w:tr>
+      <w:tr>
+        <w:tc>
+          <w:tcPr/>
+          <w:p>
+            <w:pPr>
+              <w:pStyle w:val="Compact"/>
+            </w:pPr>
+            <w:r>
+              <w:t xml:space="preserve">weighted likelihood (refit)</w:t>
+            </w:r>
+          </w:p>
+        </w:tc>
+        <w:tc>
+          <w:tcPr/>
+          <w:p>
+            <w:pPr>
+              <w:pStyle w:val="Compact"/>
+              <w:jc w:val="right"/>
+            </w:pPr>
+            <w:r>
+              <w:t xml:space="preserve">18.3</w:t>
+            </w:r>
+          </w:p>
+        </w:tc>
+        <w:tc>
+          <w:tcPr/>
+          <w:p>
+            <w:pPr>
+              <w:pStyle w:val="Compact"/>
+              <w:jc w:val="right"/>
+            </w:pPr>
+            <w:r>
+              <w:t xml:space="preserve">20.7</w:t>
+            </w:r>
+          </w:p>
+        </w:tc>
+        <w:tc>
+          <w:tcPr/>
+          <w:p>
+            <w:pPr>
+              <w:pStyle w:val="Compact"/>
+              <w:jc w:val="right"/>
+            </w:pPr>
+            <w:r>
+              <w:t xml:space="preserve">44%</w:t>
+            </w:r>
+          </w:p>
+        </w:tc>
+        <w:tc>
+          <w:tcPr/>
+          <w:p>
+            <w:pPr>
+              <w:pStyle w:val="Compact"/>
+              <w:jc w:val="right"/>
+            </w:pPr>
+            <w:r>
+              <w:t xml:space="preserve">59%</w:t>
+            </w:r>
+          </w:p>
+        </w:tc>
+        <w:tc>
+          <w:tcPr/>
+          <w:p>
+            <w:pPr>
+              <w:pStyle w:val="Compact"/>
+              <w:jc w:val="right"/>
+            </w:pPr>
+            <w:r>
+              <w:t xml:space="preserve">15%</w:t>
+            </w:r>
+          </w:p>
+        </w:tc>
+        <w:tc>
+          <w:tcPr/>
+          <w:p>
+            <w:pPr>
+              <w:pStyle w:val="Compact"/>
+              <w:jc w:val="right"/>
+            </w:pPr>
+            <w:r>
+              <w:t xml:space="preserve">23%</w:t>
+            </w:r>
+          </w:p>
+        </w:tc>
+        <w:tc>
+          <w:tcPr/>
+          <w:p>
+            <w:pPr>
+              <w:pStyle w:val="Compact"/>
+              <w:jc w:val="right"/>
+            </w:pPr>
+            <w:r>
+              <w:t xml:space="preserve">$155,075</w:t>
+            </w:r>
+          </w:p>
+        </w:tc>
+        <w:tc>
+          <w:tcPr/>
+          <w:p>
+            <w:pPr>
+              <w:pStyle w:val="Compact"/>
+              <w:jc w:val="right"/>
+            </w:pPr>
+            <w:r>
+              <w:t xml:space="preserve">$172,167</w:t>
+            </w:r>
+          </w:p>
+        </w:tc>
+        <w:tc>
+          <w:tcPr/>
+          <w:p>
+            <w:pPr>
+              <w:pStyle w:val="Compact"/>
+              <w:jc w:val="right"/>
+            </w:pPr>
+            <w:r>
+              <w:t xml:space="preserve">$35,274</w:t>
+            </w:r>
+          </w:p>
+        </w:tc>
+        <w:tc>
+          <w:tcPr/>
+          <w:p>
+            <w:pPr>
+              <w:pStyle w:val="Compact"/>
+              <w:jc w:val="right"/>
+            </w:pPr>
+            <w:r>
+              <w:t xml:space="preserve">$44,275</w:t>
+            </w:r>
+          </w:p>
+        </w:tc>
+        <w:tc>
+          <w:tcPr/>
+          <w:p>
+            <w:pPr>
+              <w:pStyle w:val="Compact"/>
+              <w:jc w:val="right"/>
+            </w:pPr>
+            <w:r>
+              <w:t xml:space="preserve">$187,408</w:t>
+            </w:r>
+          </w:p>
+        </w:tc>
+        <w:tc>
+          <w:tcPr/>
+          <w:p>
+            <w:pPr>
+              <w:pStyle w:val="Compact"/>
+              <w:jc w:val="right"/>
+            </w:pPr>
+            <w:r>
+              <w:t xml:space="preserve">$240,359</w:t>
+            </w:r>
+          </w:p>
+        </w:tc>
+        <w:tc>
+          <w:tcPr/>
+          <w:p>
+            <w:pPr>
+              <w:pStyle w:val="Compact"/>
+              <w:jc w:val="right"/>
+            </w:pPr>
+            <w:r>
+              <w:t xml:space="preserve">$2,308</w:t>
+            </w:r>
+          </w:p>
+        </w:tc>
+      </w:tr>
+      <w:tr>
+        <w:tc>
+          <w:tcPr/>
+          <w:p>
+            <w:pPr>
+              <w:pStyle w:val="Compact"/>
+            </w:pPr>
+            <w:r>
+              <w:t xml:space="preserve">dementia counts as long-term care (refit)</w:t>
+            </w:r>
+          </w:p>
+        </w:tc>
+        <w:tc>
+          <w:tcPr/>
+          <w:p>
+            <w:pPr>
+              <w:pStyle w:val="Compact"/>
+              <w:jc w:val="right"/>
+            </w:pPr>
+            <w:r>
+              <w:t xml:space="preserve">18.3</w:t>
+            </w:r>
+          </w:p>
+        </w:tc>
+        <w:tc>
+          <w:tcPr/>
+          <w:p>
+            <w:pPr>
+              <w:pStyle w:val="Compact"/>
+              <w:jc w:val="right"/>
+            </w:pPr>
+            <w:r>
+              <w:t xml:space="preserve">20.8</w:t>
+            </w:r>
+          </w:p>
+        </w:tc>
+        <w:tc>
+          <w:tcPr/>
+          <w:p>
+            <w:pPr>
+              <w:pStyle w:val="Compact"/>
+              <w:jc w:val="right"/>
+            </w:pPr>
+            <w:r>
+              <w:t xml:space="preserve">57%</w:t>
+            </w:r>
+          </w:p>
+        </w:tc>
+        <w:tc>
+          <w:tcPr/>
+          <w:p>
+            <w:pPr>
+              <w:pStyle w:val="Compact"/>
+              <w:jc w:val="right"/>
+            </w:pPr>
+            <w:r>
+              <w:t xml:space="preserve">69%</w:t>
+            </w:r>
+          </w:p>
+        </w:tc>
+        <w:tc>
+          <w:tcPr/>
+          <w:p>
+            <w:pPr>
+              <w:pStyle w:val="Compact"/>
+              <w:jc w:val="right"/>
+            </w:pPr>
+            <w:r>
+              <w:t xml:space="preserve">17%</w:t>
+            </w:r>
+          </w:p>
+        </w:tc>
+        <w:tc>
+          <w:tcPr/>
+          <w:p>
+            <w:pPr>
+              <w:pStyle w:val="Compact"/>
+              <w:jc w:val="right"/>
+            </w:pPr>
+            <w:r>
+              <w:t xml:space="preserve">26%</w:t>
+            </w:r>
+          </w:p>
+        </w:tc>
+        <w:tc>
+          <w:tcPr/>
+          <w:p>
+            <w:pPr>
+              <w:pStyle w:val="Compact"/>
+              <w:jc w:val="right"/>
+            </w:pPr>
+            <w:r>
+              <w:t xml:space="preserve">$155,783</w:t>
+            </w:r>
+          </w:p>
+        </w:tc>
+        <w:tc>
+          <w:tcPr/>
+          <w:p>
+            <w:pPr>
+              <w:pStyle w:val="Compact"/>
+              <w:jc w:val="right"/>
+            </w:pPr>
+            <w:r>
+              <w:t xml:space="preserve">$172,746</w:t>
+            </w:r>
+          </w:p>
+        </w:tc>
+        <w:tc>
+          <w:tcPr/>
+          <w:p>
+            <w:pPr>
+              <w:pStyle w:val="Compact"/>
+              <w:jc w:val="right"/>
+            </w:pPr>
+            <w:r>
+              <w:t xml:space="preserve">$35,489</w:t>
+            </w:r>
+          </w:p>
+        </w:tc>
+        <w:tc>
+          <w:tcPr/>
+          <w:p>
+            <w:pPr>
+              <w:pStyle w:val="Compact"/>
+              <w:jc w:val="right"/>
+            </w:pPr>
+            <w:r>
+              <w:t xml:space="preserve">$45,302</w:t>
+            </w:r>
+          </w:p>
+        </w:tc>
+        <w:tc>
+          <w:tcPr/>
+          <w:p>
+            <w:pPr>
+              <w:pStyle w:val="Compact"/>
+              <w:jc w:val="right"/>
+            </w:pPr>
+            <w:r>
+              <w:t xml:space="preserve">$188,082</w:t>
+            </w:r>
+          </w:p>
+        </w:tc>
+        <w:tc>
+          <w:tcPr/>
+          <w:p>
+            <w:pPr>
+              <w:pStyle w:val="Compact"/>
+              <w:jc w:val="right"/>
+            </w:pPr>
+            <w:r>
+              <w:t xml:space="preserve">$251,586</w:t>
+            </w:r>
+          </w:p>
+        </w:tc>
+        <w:tc>
+          <w:tcPr/>
+          <w:p>
+            <w:pPr>
+              <w:pStyle w:val="Compact"/>
+              <w:jc w:val="right"/>
+            </w:pPr>
+            <w:r>
+              <w:t xml:space="preserve">$2,353</w:t>
+            </w:r>
+          </w:p>
+        </w:tc>
+      </w:tr>
+      <w:tr>
+        <w:tc>
+          <w:tcPr/>
+          <w:p>
+            <w:pPr>
+              <w:pStyle w:val="Compact"/>
+            </w:pPr>
+            <w:r>
+              <w:t xml:space="preserve">waves 9-16 only (refit)</w:t>
+            </w:r>
+          </w:p>
+        </w:tc>
+        <w:tc>
+          <w:tcPr/>
+          <w:p>
+            <w:pPr>
+              <w:pStyle w:val="Compact"/>
+              <w:jc w:val="right"/>
+            </w:pPr>
+            <w:r>
+              <w:t xml:space="preserve">18.2</w:t>
+            </w:r>
+          </w:p>
+        </w:tc>
+        <w:tc>
+          <w:tcPr/>
+          <w:p>
+            <w:pPr>
+              <w:pStyle w:val="Compact"/>
+              <w:jc w:val="right"/>
+            </w:pPr>
+            <w:r>
+              <w:t xml:space="preserve">20.7</w:t>
+            </w:r>
+          </w:p>
+        </w:tc>
+        <w:tc>
+          <w:tcPr/>
+          <w:p>
+            <w:pPr>
+              <w:pStyle w:val="Compact"/>
+              <w:jc w:val="right"/>
+            </w:pPr>
+            <w:r>
+              <w:t xml:space="preserve">45%</w:t>
+            </w:r>
+          </w:p>
+        </w:tc>
+        <w:tc>
+          <w:tcPr/>
+          <w:p>
+            <w:pPr>
+              <w:pStyle w:val="Compact"/>
+              <w:jc w:val="right"/>
+            </w:pPr>
+            <w:r>
+              <w:t xml:space="preserve">58%</w:t>
+            </w:r>
+          </w:p>
+        </w:tc>
+        <w:tc>
+          <w:tcPr/>
+          <w:p>
+            <w:pPr>
+              <w:pStyle w:val="Compact"/>
+              <w:jc w:val="right"/>
+            </w:pPr>
+            <w:r>
+              <w:t xml:space="preserve">16%</w:t>
+            </w:r>
+          </w:p>
+        </w:tc>
+        <w:tc>
+          <w:tcPr/>
+          <w:p>
+            <w:pPr>
+              <w:pStyle w:val="Compact"/>
+              <w:jc w:val="right"/>
+            </w:pPr>
+            <w:r>
+              <w:t xml:space="preserve">23%</w:t>
+            </w:r>
+          </w:p>
+        </w:tc>
+        <w:tc>
+          <w:tcPr/>
+          <w:p>
+            <w:pPr>
+              <w:pStyle w:val="Compact"/>
+              <w:jc w:val="right"/>
+            </w:pPr>
+            <w:r>
+              <w:t xml:space="preserve">$155,369</w:t>
+            </w:r>
+          </w:p>
+        </w:tc>
+        <w:tc>
+          <w:tcPr/>
+          <w:p>
+            <w:pPr>
+              <w:pStyle w:val="Compact"/>
+              <w:jc w:val="right"/>
+            </w:pPr>
+            <w:r>
+              <w:t xml:space="preserve">$172,640</w:t>
+            </w:r>
+          </w:p>
+        </w:tc>
+        <w:tc>
+          <w:tcPr/>
+          <w:p>
+            <w:pPr>
+              <w:pStyle w:val="Compact"/>
+              <w:jc w:val="right"/>
+            </w:pPr>
+            <w:r>
+              <w:t xml:space="preserve">$34,481</w:t>
+            </w:r>
+          </w:p>
+        </w:tc>
+        <w:tc>
+          <w:tcPr/>
+          <w:p>
+            <w:pPr>
+              <w:pStyle w:val="Compact"/>
+              <w:jc w:val="right"/>
+            </w:pPr>
+            <w:r>
+              <w:t xml:space="preserve">$42,606</w:t>
+            </w:r>
+          </w:p>
+        </w:tc>
+        <w:tc>
+          <w:tcPr/>
+          <w:p>
+            <w:pPr>
+              <w:pStyle w:val="Compact"/>
+              <w:jc w:val="right"/>
+            </w:pPr>
+            <w:r>
+              <w:t xml:space="preserve">$183,424</w:t>
+            </w:r>
+          </w:p>
+        </w:tc>
+        <w:tc>
+          <w:tcPr/>
+          <w:p>
+            <w:pPr>
+              <w:pStyle w:val="Compact"/>
+              <w:jc w:val="right"/>
+            </w:pPr>
+            <w:r>
+              <w:t xml:space="preserve">$232,429</w:t>
+            </w:r>
+          </w:p>
+        </w:tc>
+        <w:tc>
+          <w:tcPr/>
+          <w:p>
+            <w:pPr>
+              <w:pStyle w:val="Compact"/>
+              <w:jc w:val="right"/>
+            </w:pPr>
+            <w:r>
+              <w:t xml:space="preserve">$2,159</w:t>
+            </w:r>
+          </w:p>
+        </w:tc>
+      </w:tr>
+      <w:tr>
+        <w:tc>
+          <w:tcPr/>
+          <w:p>
+            <w:pPr>
+              <w:pStyle w:val="Compact"/>
+            </w:pPr>
+            <w:r>
+              <w:t xml:space="preserve">L at 2+ ADLs (refit)</w:t>
+            </w:r>
+          </w:p>
+        </w:tc>
+        <w:tc>
+          <w:tcPr/>
+          <w:p>
+            <w:pPr>
+              <w:pStyle w:val="Compact"/>
+              <w:jc w:val="right"/>
+            </w:pPr>
+            <w:r>
+              <w:t xml:space="preserve">18.3</w:t>
+            </w:r>
+          </w:p>
+        </w:tc>
+        <w:tc>
+          <w:tcPr/>
+          <w:p>
+            <w:pPr>
+              <w:pStyle w:val="Compact"/>
+              <w:jc w:val="right"/>
+            </w:pPr>
+            <w:r>
+              <w:t xml:space="preserve">20.8</w:t>
+            </w:r>
+          </w:p>
+        </w:tc>
+        <w:tc>
+          <w:tcPr/>
+          <w:p>
+            <w:pPr>
+              <w:pStyle w:val="Compact"/>
+              <w:jc w:val="right"/>
+            </w:pPr>
+            <w:r>
+              <w:t xml:space="preserve">58%</w:t>
+            </w:r>
+          </w:p>
+        </w:tc>
+        <w:tc>
+          <w:tcPr/>
+          <w:p>
+            <w:pPr>
+              <w:pStyle w:val="Compact"/>
+              <w:jc w:val="right"/>
+            </w:pPr>
+            <w:r>
+              <w:t xml:space="preserve">71%</w:t>
+            </w:r>
+          </w:p>
+        </w:tc>
+        <w:tc>
+          <w:tcPr/>
+          <w:p>
+            <w:pPr>
+              <w:pStyle w:val="Compact"/>
+              <w:jc w:val="right"/>
+            </w:pPr>
+            <w:r>
+              <w:t xml:space="preserve">17%</w:t>
+            </w:r>
+          </w:p>
+        </w:tc>
+        <w:tc>
+          <w:tcPr/>
+          <w:p>
+            <w:pPr>
+              <w:pStyle w:val="Compact"/>
+              <w:jc w:val="right"/>
+            </w:pPr>
+            <w:r>
+              <w:t xml:space="preserve">26%</w:t>
+            </w:r>
+          </w:p>
+        </w:tc>
+        <w:tc>
+          <w:tcPr/>
+          <w:p>
+            <w:pPr>
+              <w:pStyle w:val="Compact"/>
+              <w:jc w:val="right"/>
+            </w:pPr>
+            <w:r>
+              <w:t xml:space="preserve">$155,626</w:t>
+            </w:r>
+          </w:p>
+        </w:tc>
+        <w:tc>
+          <w:tcPr/>
+          <w:p>
+            <w:pPr>
+              <w:pStyle w:val="Compact"/>
+              <w:jc w:val="right"/>
+            </w:pPr>
+            <w:r>
+              <w:t xml:space="preserve">$173,040</w:t>
+            </w:r>
+          </w:p>
+        </w:tc>
+        <w:tc>
+          <w:tcPr/>
+          <w:p>
+            <w:pPr>
+              <w:pStyle w:val="Compact"/>
+              <w:jc w:val="right"/>
+            </w:pPr>
+            <w:r>
+              <w:t xml:space="preserve">$35,599</w:t>
+            </w:r>
+          </w:p>
+        </w:tc>
+        <w:tc>
+          <w:tcPr/>
+          <w:p>
+            <w:pPr>
+              <w:pStyle w:val="Compact"/>
+              <w:jc w:val="right"/>
+            </w:pPr>
+            <w:r>
+              <w:t xml:space="preserve">$44,382</w:t>
+            </w:r>
+          </w:p>
+        </w:tc>
+        <w:tc>
+          <w:tcPr/>
+          <w:p>
+            <w:pPr>
+              <w:pStyle w:val="Compact"/>
+              <w:jc w:val="right"/>
+            </w:pPr>
+            <w:r>
+              <w:t xml:space="preserve">$191,305</w:t>
+            </w:r>
+          </w:p>
+        </w:tc>
+        <w:tc>
+          <w:tcPr/>
+          <w:p>
+            <w:pPr>
+              <w:pStyle w:val="Compact"/>
+              <w:jc w:val="right"/>
+            </w:pPr>
+            <w:r>
+              <w:t xml:space="preserve">$240,045</w:t>
+            </w:r>
+          </w:p>
+        </w:tc>
+        <w:tc>
+          <w:tcPr/>
+          <w:p>
+            <w:pPr>
+              <w:pStyle w:val="Compact"/>
+              <w:jc w:val="right"/>
+            </w:pPr>
+            <w:r>
+              <w:t xml:space="preserve">$2,442</w:t>
+            </w:r>
+          </w:p>
+        </w:tc>
+      </w:tr>
     </w:tbl>
     <w:bookmarkEnd w:id="56"/>
     <w:bookmarkStart w:id="57" w:name="appendix-tables"/>
@@ -41065,7 +41767,7 @@
           <w:i/>
           <w:iCs/>
         </w:rPr>
-        <w:t xml:space="preserve">duration: in the same state at the previous interview, a coarse proxy for duration in state and a first-order check on the Markov assumption. income: low and high household income tertile against middle. Each extension re-estimates the model; only those listed were run.</w:t>
+        <w:t xml:space="preserve">duration: in the same state at the previous interview, a coarse proxy for duration in state and a first-order check on the Markov assumption. income: low and high household income tertile against middle. period: calendar year, per decade from 2010. Each extension re-estimates the model; only those listed were run.</w:t>
       </w:r>
     </w:p>
     <w:tbl>
@@ -41151,7 +41853,7 @@
               <w:jc w:val="right"/>
             </w:pPr>
             <w:r>
-              <w:t xml:space="preserve">12</w:t>
+              <w:t xml:space="preserve">18</w:t>
             </w:r>
           </w:p>
         </w:tc>
@@ -41188,7 +41890,44 @@
               <w:jc w:val="right"/>
             </w:pPr>
             <w:r>
-              <w:t xml:space="preserve">24</w:t>
+              <w:t xml:space="preserve">36</w:t>
+            </w:r>
+          </w:p>
+        </w:tc>
+      </w:tr>
+      <w:tr>
+        <w:tc>
+          <w:tcPr/>
+          <w:p>
+            <w:pPr>
+              <w:pStyle w:val="Compact"/>
+            </w:pPr>
+            <w:r>
+              <w:t xml:space="preserve">period</w:t>
+            </w:r>
+          </w:p>
+        </w:tc>
+        <w:tc>
+          <w:tcPr/>
+          <w:p>
+            <w:pPr>
+              <w:pStyle w:val="Compact"/>
+              <w:jc w:val="right"/>
+            </w:pPr>
+            <w:r>
+              <w:t xml:space="preserve">354.8</w:t>
+            </w:r>
+          </w:p>
+        </w:tc>
+        <w:tc>
+          <w:tcPr/>
+          <w:p>
+            <w:pPr>
+              <w:pStyle w:val="Compact"/>
+              <w:jc w:val="right"/>
+            </w:pPr>
+            <w:r>
+              <w:t xml:space="preserve">18</w:t>
             </w:r>
           </w:p>
         </w:tc>
@@ -45223,6 +45962,1320 @@
             </w:pPr>
             <w:r>
               <w:t xml:space="preserve">1.12</w:t>
+            </w:r>
+          </w:p>
+        </w:tc>
+      </w:tr>
+      <w:tr>
+        <w:tc>
+          <w:tcPr/>
+          <w:p>
+            <w:pPr>
+              <w:pStyle w:val="Compact"/>
+            </w:pPr>
+            <w:r>
+              <w:t xml:space="preserve">period</w:t>
+            </w:r>
+          </w:p>
+        </w:tc>
+        <w:tc>
+          <w:tcPr/>
+          <w:p>
+            <w:pPr>
+              <w:pStyle w:val="Compact"/>
+              <w:jc w:val="right"/>
+            </w:pPr>
+            <w:r>
+              <w:t xml:space="preserve">H to C</w:t>
+            </w:r>
+          </w:p>
+        </w:tc>
+        <w:tc>
+          <w:tcPr/>
+          <w:p>
+            <w:pPr>
+              <w:pStyle w:val="Compact"/>
+              <w:jc w:val="right"/>
+            </w:pPr>
+            <w:r>
+              <w:t xml:space="preserve">period</w:t>
+            </w:r>
+          </w:p>
+        </w:tc>
+        <w:tc>
+          <w:tcPr/>
+          <w:p>
+            <w:pPr>
+              <w:pStyle w:val="Compact"/>
+              <w:jc w:val="right"/>
+            </w:pPr>
+            <w:r>
+              <w:t xml:space="preserve">0.98</w:t>
+            </w:r>
+          </w:p>
+        </w:tc>
+        <w:tc>
+          <w:tcPr/>
+          <w:p>
+            <w:pPr>
+              <w:pStyle w:val="Compact"/>
+              <w:jc w:val="right"/>
+            </w:pPr>
+            <w:r>
+              <w:t xml:space="preserve">0.94</w:t>
+            </w:r>
+          </w:p>
+        </w:tc>
+        <w:tc>
+          <w:tcPr/>
+          <w:p>
+            <w:pPr>
+              <w:pStyle w:val="Compact"/>
+              <w:jc w:val="right"/>
+            </w:pPr>
+            <w:r>
+              <w:t xml:space="preserve">1.02</w:t>
+            </w:r>
+          </w:p>
+        </w:tc>
+      </w:tr>
+      <w:tr>
+        <w:tc>
+          <w:tcPr/>
+          <w:p>
+            <w:pPr>
+              <w:pStyle w:val="Compact"/>
+            </w:pPr>
+            <w:r>
+              <w:t xml:space="preserve">period</w:t>
+            </w:r>
+          </w:p>
+        </w:tc>
+        <w:tc>
+          <w:tcPr/>
+          <w:p>
+            <w:pPr>
+              <w:pStyle w:val="Compact"/>
+              <w:jc w:val="right"/>
+            </w:pPr>
+            <w:r>
+              <w:t xml:space="preserve">H to D</w:t>
+            </w:r>
+          </w:p>
+        </w:tc>
+        <w:tc>
+          <w:tcPr/>
+          <w:p>
+            <w:pPr>
+              <w:pStyle w:val="Compact"/>
+              <w:jc w:val="right"/>
+            </w:pPr>
+            <w:r>
+              <w:t xml:space="preserve">period</w:t>
+            </w:r>
+          </w:p>
+        </w:tc>
+        <w:tc>
+          <w:tcPr/>
+          <w:p>
+            <w:pPr>
+              <w:pStyle w:val="Compact"/>
+              <w:jc w:val="right"/>
+            </w:pPr>
+            <w:r>
+              <w:t xml:space="preserve">0.79</w:t>
+            </w:r>
+          </w:p>
+        </w:tc>
+        <w:tc>
+          <w:tcPr/>
+          <w:p>
+            <w:pPr>
+              <w:pStyle w:val="Compact"/>
+              <w:jc w:val="right"/>
+            </w:pPr>
+            <w:r>
+              <w:t xml:space="preserve">0.67</w:t>
+            </w:r>
+          </w:p>
+        </w:tc>
+        <w:tc>
+          <w:tcPr/>
+          <w:p>
+            <w:pPr>
+              <w:pStyle w:val="Compact"/>
+              <w:jc w:val="right"/>
+            </w:pPr>
+            <w:r>
+              <w:t xml:space="preserve">0.92</w:t>
+            </w:r>
+          </w:p>
+        </w:tc>
+      </w:tr>
+      <w:tr>
+        <w:tc>
+          <w:tcPr/>
+          <w:p>
+            <w:pPr>
+              <w:pStyle w:val="Compact"/>
+            </w:pPr>
+            <w:r>
+              <w:t xml:space="preserve">period</w:t>
+            </w:r>
+          </w:p>
+        </w:tc>
+        <w:tc>
+          <w:tcPr/>
+          <w:p>
+            <w:pPr>
+              <w:pStyle w:val="Compact"/>
+              <w:jc w:val="right"/>
+            </w:pPr>
+            <w:r>
+              <w:t xml:space="preserve">H to X</w:t>
+            </w:r>
+          </w:p>
+        </w:tc>
+        <w:tc>
+          <w:tcPr/>
+          <w:p>
+            <w:pPr>
+              <w:pStyle w:val="Compact"/>
+              <w:jc w:val="right"/>
+            </w:pPr>
+            <w:r>
+              <w:t xml:space="preserve">period</w:t>
+            </w:r>
+          </w:p>
+        </w:tc>
+        <w:tc>
+          <w:tcPr/>
+          <w:p>
+            <w:pPr>
+              <w:pStyle w:val="Compact"/>
+              <w:jc w:val="right"/>
+            </w:pPr>
+            <w:r>
+              <w:t xml:space="preserve">0.96</w:t>
+            </w:r>
+          </w:p>
+        </w:tc>
+        <w:tc>
+          <w:tcPr/>
+          <w:p>
+            <w:pPr>
+              <w:pStyle w:val="Compact"/>
+              <w:jc w:val="right"/>
+            </w:pPr>
+            <w:r>
+              <w:t xml:space="preserve">0.71</w:t>
+            </w:r>
+          </w:p>
+        </w:tc>
+        <w:tc>
+          <w:tcPr/>
+          <w:p>
+            <w:pPr>
+              <w:pStyle w:val="Compact"/>
+              <w:jc w:val="right"/>
+            </w:pPr>
+            <w:r>
+              <w:t xml:space="preserve">1.32</w:t>
+            </w:r>
+          </w:p>
+        </w:tc>
+      </w:tr>
+      <w:tr>
+        <w:tc>
+          <w:tcPr/>
+          <w:p>
+            <w:pPr>
+              <w:pStyle w:val="Compact"/>
+            </w:pPr>
+            <w:r>
+              <w:t xml:space="preserve">period</w:t>
+            </w:r>
+          </w:p>
+        </w:tc>
+        <w:tc>
+          <w:tcPr/>
+          <w:p>
+            <w:pPr>
+              <w:pStyle w:val="Compact"/>
+              <w:jc w:val="right"/>
+            </w:pPr>
+            <w:r>
+              <w:t xml:space="preserve">C to D</w:t>
+            </w:r>
+          </w:p>
+        </w:tc>
+        <w:tc>
+          <w:tcPr/>
+          <w:p>
+            <w:pPr>
+              <w:pStyle w:val="Compact"/>
+              <w:jc w:val="right"/>
+            </w:pPr>
+            <w:r>
+              <w:t xml:space="preserve">period</w:t>
+            </w:r>
+          </w:p>
+        </w:tc>
+        <w:tc>
+          <w:tcPr/>
+          <w:p>
+            <w:pPr>
+              <w:pStyle w:val="Compact"/>
+              <w:jc w:val="right"/>
+            </w:pPr>
+            <w:r>
+              <w:t xml:space="preserve">0.95</w:t>
+            </w:r>
+          </w:p>
+        </w:tc>
+        <w:tc>
+          <w:tcPr/>
+          <w:p>
+            <w:pPr>
+              <w:pStyle w:val="Compact"/>
+              <w:jc w:val="right"/>
+            </w:pPr>
+            <w:r>
+              <w:t xml:space="preserve">0.92</w:t>
+            </w:r>
+          </w:p>
+        </w:tc>
+        <w:tc>
+          <w:tcPr/>
+          <w:p>
+            <w:pPr>
+              <w:pStyle w:val="Compact"/>
+              <w:jc w:val="right"/>
+            </w:pPr>
+            <w:r>
+              <w:t xml:space="preserve">0.97</w:t>
+            </w:r>
+          </w:p>
+        </w:tc>
+      </w:tr>
+      <w:tr>
+        <w:tc>
+          <w:tcPr/>
+          <w:p>
+            <w:pPr>
+              <w:pStyle w:val="Compact"/>
+            </w:pPr>
+            <w:r>
+              <w:t xml:space="preserve">period</w:t>
+            </w:r>
+          </w:p>
+        </w:tc>
+        <w:tc>
+          <w:tcPr/>
+          <w:p>
+            <w:pPr>
+              <w:pStyle w:val="Compact"/>
+              <w:jc w:val="right"/>
+            </w:pPr>
+            <w:r>
+              <w:t xml:space="preserve">C to L</w:t>
+            </w:r>
+          </w:p>
+        </w:tc>
+        <w:tc>
+          <w:tcPr/>
+          <w:p>
+            <w:pPr>
+              <w:pStyle w:val="Compact"/>
+              <w:jc w:val="right"/>
+            </w:pPr>
+            <w:r>
+              <w:t xml:space="preserve">period</w:t>
+            </w:r>
+          </w:p>
+        </w:tc>
+        <w:tc>
+          <w:tcPr/>
+          <w:p>
+            <w:pPr>
+              <w:pStyle w:val="Compact"/>
+              <w:jc w:val="right"/>
+            </w:pPr>
+            <w:r>
+              <w:t xml:space="preserve">0.69</w:t>
+            </w:r>
+          </w:p>
+        </w:tc>
+        <w:tc>
+          <w:tcPr/>
+          <w:p>
+            <w:pPr>
+              <w:pStyle w:val="Compact"/>
+              <w:jc w:val="right"/>
+            </w:pPr>
+            <w:r>
+              <w:t xml:space="preserve">0.46</w:t>
+            </w:r>
+          </w:p>
+        </w:tc>
+        <w:tc>
+          <w:tcPr/>
+          <w:p>
+            <w:pPr>
+              <w:pStyle w:val="Compact"/>
+              <w:jc w:val="right"/>
+            </w:pPr>
+            <w:r>
+              <w:t xml:space="preserve">1.04</w:t>
+            </w:r>
+          </w:p>
+        </w:tc>
+      </w:tr>
+      <w:tr>
+        <w:tc>
+          <w:tcPr/>
+          <w:p>
+            <w:pPr>
+              <w:pStyle w:val="Compact"/>
+            </w:pPr>
+            <w:r>
+              <w:t xml:space="preserve">period</w:t>
+            </w:r>
+          </w:p>
+        </w:tc>
+        <w:tc>
+          <w:tcPr/>
+          <w:p>
+            <w:pPr>
+              <w:pStyle w:val="Compact"/>
+              <w:jc w:val="right"/>
+            </w:pPr>
+            <w:r>
+              <w:t xml:space="preserve">C to N</w:t>
+            </w:r>
+          </w:p>
+        </w:tc>
+        <w:tc>
+          <w:tcPr/>
+          <w:p>
+            <w:pPr>
+              <w:pStyle w:val="Compact"/>
+              <w:jc w:val="right"/>
+            </w:pPr>
+            <w:r>
+              <w:t xml:space="preserve">period</w:t>
+            </w:r>
+          </w:p>
+        </w:tc>
+        <w:tc>
+          <w:tcPr/>
+          <w:p>
+            <w:pPr>
+              <w:pStyle w:val="Compact"/>
+              <w:jc w:val="right"/>
+            </w:pPr>
+            <w:r>
+              <w:t xml:space="preserve">0.70</w:t>
+            </w:r>
+          </w:p>
+        </w:tc>
+        <w:tc>
+          <w:tcPr/>
+          <w:p>
+            <w:pPr>
+              <w:pStyle w:val="Compact"/>
+              <w:jc w:val="right"/>
+            </w:pPr>
+            <w:r>
+              <w:t xml:space="preserve">0.61</w:t>
+            </w:r>
+          </w:p>
+        </w:tc>
+        <w:tc>
+          <w:tcPr/>
+          <w:p>
+            <w:pPr>
+              <w:pStyle w:val="Compact"/>
+              <w:jc w:val="right"/>
+            </w:pPr>
+            <w:r>
+              <w:t xml:space="preserve">0.81</w:t>
+            </w:r>
+          </w:p>
+        </w:tc>
+      </w:tr>
+      <w:tr>
+        <w:tc>
+          <w:tcPr/>
+          <w:p>
+            <w:pPr>
+              <w:pStyle w:val="Compact"/>
+            </w:pPr>
+            <w:r>
+              <w:t xml:space="preserve">period</w:t>
+            </w:r>
+          </w:p>
+        </w:tc>
+        <w:tc>
+          <w:tcPr/>
+          <w:p>
+            <w:pPr>
+              <w:pStyle w:val="Compact"/>
+              <w:jc w:val="right"/>
+            </w:pPr>
+            <w:r>
+              <w:t xml:space="preserve">C to X</w:t>
+            </w:r>
+          </w:p>
+        </w:tc>
+        <w:tc>
+          <w:tcPr/>
+          <w:p>
+            <w:pPr>
+              <w:pStyle w:val="Compact"/>
+              <w:jc w:val="right"/>
+            </w:pPr>
+            <w:r>
+              <w:t xml:space="preserve">period</w:t>
+            </w:r>
+          </w:p>
+        </w:tc>
+        <w:tc>
+          <w:tcPr/>
+          <w:p>
+            <w:pPr>
+              <w:pStyle w:val="Compact"/>
+              <w:jc w:val="right"/>
+            </w:pPr>
+            <w:r>
+              <w:t xml:space="preserve">0.87</w:t>
+            </w:r>
+          </w:p>
+        </w:tc>
+        <w:tc>
+          <w:tcPr/>
+          <w:p>
+            <w:pPr>
+              <w:pStyle w:val="Compact"/>
+              <w:jc w:val="right"/>
+            </w:pPr>
+            <w:r>
+              <w:t xml:space="preserve">0.82</w:t>
+            </w:r>
+          </w:p>
+        </w:tc>
+        <w:tc>
+          <w:tcPr/>
+          <w:p>
+            <w:pPr>
+              <w:pStyle w:val="Compact"/>
+              <w:jc w:val="right"/>
+            </w:pPr>
+            <w:r>
+              <w:t xml:space="preserve">0.92</w:t>
+            </w:r>
+          </w:p>
+        </w:tc>
+      </w:tr>
+      <w:tr>
+        <w:tc>
+          <w:tcPr/>
+          <w:p>
+            <w:pPr>
+              <w:pStyle w:val="Compact"/>
+            </w:pPr>
+            <w:r>
+              <w:t xml:space="preserve">period</w:t>
+            </w:r>
+          </w:p>
+        </w:tc>
+        <w:tc>
+          <w:tcPr/>
+          <w:p>
+            <w:pPr>
+              <w:pStyle w:val="Compact"/>
+              <w:jc w:val="right"/>
+            </w:pPr>
+            <w:r>
+              <w:t xml:space="preserve">D to H</w:t>
+            </w:r>
+          </w:p>
+        </w:tc>
+        <w:tc>
+          <w:tcPr/>
+          <w:p>
+            <w:pPr>
+              <w:pStyle w:val="Compact"/>
+              <w:jc w:val="right"/>
+            </w:pPr>
+            <w:r>
+              <w:t xml:space="preserve">period</w:t>
+            </w:r>
+          </w:p>
+        </w:tc>
+        <w:tc>
+          <w:tcPr/>
+          <w:p>
+            <w:pPr>
+              <w:pStyle w:val="Compact"/>
+              <w:jc w:val="right"/>
+            </w:pPr>
+            <w:r>
+              <w:t xml:space="preserve">0.50</w:t>
+            </w:r>
+          </w:p>
+        </w:tc>
+        <w:tc>
+          <w:tcPr/>
+          <w:p>
+            <w:pPr>
+              <w:pStyle w:val="Compact"/>
+              <w:jc w:val="right"/>
+            </w:pPr>
+            <w:r>
+              <w:t xml:space="preserve">0.43</w:t>
+            </w:r>
+          </w:p>
+        </w:tc>
+        <w:tc>
+          <w:tcPr/>
+          <w:p>
+            <w:pPr>
+              <w:pStyle w:val="Compact"/>
+              <w:jc w:val="right"/>
+            </w:pPr>
+            <w:r>
+              <w:t xml:space="preserve">0.59</w:t>
+            </w:r>
+          </w:p>
+        </w:tc>
+      </w:tr>
+      <w:tr>
+        <w:tc>
+          <w:tcPr/>
+          <w:p>
+            <w:pPr>
+              <w:pStyle w:val="Compact"/>
+            </w:pPr>
+            <w:r>
+              <w:t xml:space="preserve">period</w:t>
+            </w:r>
+          </w:p>
+        </w:tc>
+        <w:tc>
+          <w:tcPr/>
+          <w:p>
+            <w:pPr>
+              <w:pStyle w:val="Compact"/>
+              <w:jc w:val="right"/>
+            </w:pPr>
+            <w:r>
+              <w:t xml:space="preserve">D to C</w:t>
+            </w:r>
+          </w:p>
+        </w:tc>
+        <w:tc>
+          <w:tcPr/>
+          <w:p>
+            <w:pPr>
+              <w:pStyle w:val="Compact"/>
+              <w:jc w:val="right"/>
+            </w:pPr>
+            <w:r>
+              <w:t xml:space="preserve">period</w:t>
+            </w:r>
+          </w:p>
+        </w:tc>
+        <w:tc>
+          <w:tcPr/>
+          <w:p>
+            <w:pPr>
+              <w:pStyle w:val="Compact"/>
+              <w:jc w:val="right"/>
+            </w:pPr>
+            <w:r>
+              <w:t xml:space="preserve">0.95</w:t>
+            </w:r>
+          </w:p>
+        </w:tc>
+        <w:tc>
+          <w:tcPr/>
+          <w:p>
+            <w:pPr>
+              <w:pStyle w:val="Compact"/>
+              <w:jc w:val="right"/>
+            </w:pPr>
+            <w:r>
+              <w:t xml:space="preserve">0.92</w:t>
+            </w:r>
+          </w:p>
+        </w:tc>
+        <w:tc>
+          <w:tcPr/>
+          <w:p>
+            <w:pPr>
+              <w:pStyle w:val="Compact"/>
+              <w:jc w:val="right"/>
+            </w:pPr>
+            <w:r>
+              <w:t xml:space="preserve">0.99</w:t>
+            </w:r>
+          </w:p>
+        </w:tc>
+      </w:tr>
+      <w:tr>
+        <w:tc>
+          <w:tcPr/>
+          <w:p>
+            <w:pPr>
+              <w:pStyle w:val="Compact"/>
+            </w:pPr>
+            <w:r>
+              <w:t xml:space="preserve">period</w:t>
+            </w:r>
+          </w:p>
+        </w:tc>
+        <w:tc>
+          <w:tcPr/>
+          <w:p>
+            <w:pPr>
+              <w:pStyle w:val="Compact"/>
+              <w:jc w:val="right"/>
+            </w:pPr>
+            <w:r>
+              <w:t xml:space="preserve">D to L</w:t>
+            </w:r>
+          </w:p>
+        </w:tc>
+        <w:tc>
+          <w:tcPr/>
+          <w:p>
+            <w:pPr>
+              <w:pStyle w:val="Compact"/>
+              <w:jc w:val="right"/>
+            </w:pPr>
+            <w:r>
+              <w:t xml:space="preserve">period</w:t>
+            </w:r>
+          </w:p>
+        </w:tc>
+        <w:tc>
+          <w:tcPr/>
+          <w:p>
+            <w:pPr>
+              <w:pStyle w:val="Compact"/>
+              <w:jc w:val="right"/>
+            </w:pPr>
+            <w:r>
+              <w:t xml:space="preserve">1.05</w:t>
+            </w:r>
+          </w:p>
+        </w:tc>
+        <w:tc>
+          <w:tcPr/>
+          <w:p>
+            <w:pPr>
+              <w:pStyle w:val="Compact"/>
+              <w:jc w:val="right"/>
+            </w:pPr>
+            <w:r>
+              <w:t xml:space="preserve">1.00</w:t>
+            </w:r>
+          </w:p>
+        </w:tc>
+        <w:tc>
+          <w:tcPr/>
+          <w:p>
+            <w:pPr>
+              <w:pStyle w:val="Compact"/>
+              <w:jc w:val="right"/>
+            </w:pPr>
+            <w:r>
+              <w:t xml:space="preserve">1.11</w:t>
+            </w:r>
+          </w:p>
+        </w:tc>
+      </w:tr>
+      <w:tr>
+        <w:tc>
+          <w:tcPr/>
+          <w:p>
+            <w:pPr>
+              <w:pStyle w:val="Compact"/>
+            </w:pPr>
+            <w:r>
+              <w:t xml:space="preserve">period</w:t>
+            </w:r>
+          </w:p>
+        </w:tc>
+        <w:tc>
+          <w:tcPr/>
+          <w:p>
+            <w:pPr>
+              <w:pStyle w:val="Compact"/>
+              <w:jc w:val="right"/>
+            </w:pPr>
+            <w:r>
+              <w:t xml:space="preserve">D to N</w:t>
+            </w:r>
+          </w:p>
+        </w:tc>
+        <w:tc>
+          <w:tcPr/>
+          <w:p>
+            <w:pPr>
+              <w:pStyle w:val="Compact"/>
+              <w:jc w:val="right"/>
+            </w:pPr>
+            <w:r>
+              <w:t xml:space="preserve">period</w:t>
+            </w:r>
+          </w:p>
+        </w:tc>
+        <w:tc>
+          <w:tcPr/>
+          <w:p>
+            <w:pPr>
+              <w:pStyle w:val="Compact"/>
+              <w:jc w:val="right"/>
+            </w:pPr>
+            <w:r>
+              <w:t xml:space="preserve">0.70</w:t>
+            </w:r>
+          </w:p>
+        </w:tc>
+        <w:tc>
+          <w:tcPr/>
+          <w:p>
+            <w:pPr>
+              <w:pStyle w:val="Compact"/>
+              <w:jc w:val="right"/>
+            </w:pPr>
+            <w:r>
+              <w:t xml:space="preserve">0.59</w:t>
+            </w:r>
+          </w:p>
+        </w:tc>
+        <w:tc>
+          <w:tcPr/>
+          <w:p>
+            <w:pPr>
+              <w:pStyle w:val="Compact"/>
+              <w:jc w:val="right"/>
+            </w:pPr>
+            <w:r>
+              <w:t xml:space="preserve">0.84</w:t>
+            </w:r>
+          </w:p>
+        </w:tc>
+      </w:tr>
+      <w:tr>
+        <w:tc>
+          <w:tcPr/>
+          <w:p>
+            <w:pPr>
+              <w:pStyle w:val="Compact"/>
+            </w:pPr>
+            <w:r>
+              <w:t xml:space="preserve">period</w:t>
+            </w:r>
+          </w:p>
+        </w:tc>
+        <w:tc>
+          <w:tcPr/>
+          <w:p>
+            <w:pPr>
+              <w:pStyle w:val="Compact"/>
+              <w:jc w:val="right"/>
+            </w:pPr>
+            <w:r>
+              <w:t xml:space="preserve">D to X</w:t>
+            </w:r>
+          </w:p>
+        </w:tc>
+        <w:tc>
+          <w:tcPr/>
+          <w:p>
+            <w:pPr>
+              <w:pStyle w:val="Compact"/>
+              <w:jc w:val="right"/>
+            </w:pPr>
+            <w:r>
+              <w:t xml:space="preserve">period</w:t>
+            </w:r>
+          </w:p>
+        </w:tc>
+        <w:tc>
+          <w:tcPr/>
+          <w:p>
+            <w:pPr>
+              <w:pStyle w:val="Compact"/>
+              <w:jc w:val="right"/>
+            </w:pPr>
+            <w:r>
+              <w:t xml:space="preserve">1.13</w:t>
+            </w:r>
+          </w:p>
+        </w:tc>
+        <w:tc>
+          <w:tcPr/>
+          <w:p>
+            <w:pPr>
+              <w:pStyle w:val="Compact"/>
+              <w:jc w:val="right"/>
+            </w:pPr>
+            <w:r>
+              <w:t xml:space="preserve">1.01</w:t>
+            </w:r>
+          </w:p>
+        </w:tc>
+        <w:tc>
+          <w:tcPr/>
+          <w:p>
+            <w:pPr>
+              <w:pStyle w:val="Compact"/>
+              <w:jc w:val="right"/>
+            </w:pPr>
+            <w:r>
+              <w:t xml:space="preserve">1.27</w:t>
+            </w:r>
+          </w:p>
+        </w:tc>
+      </w:tr>
+      <w:tr>
+        <w:tc>
+          <w:tcPr/>
+          <w:p>
+            <w:pPr>
+              <w:pStyle w:val="Compact"/>
+            </w:pPr>
+            <w:r>
+              <w:t xml:space="preserve">period</w:t>
+            </w:r>
+          </w:p>
+        </w:tc>
+        <w:tc>
+          <w:tcPr/>
+          <w:p>
+            <w:pPr>
+              <w:pStyle w:val="Compact"/>
+              <w:jc w:val="right"/>
+            </w:pPr>
+            <w:r>
+              <w:t xml:space="preserve">L to D</w:t>
+            </w:r>
+          </w:p>
+        </w:tc>
+        <w:tc>
+          <w:tcPr/>
+          <w:p>
+            <w:pPr>
+              <w:pStyle w:val="Compact"/>
+              <w:jc w:val="right"/>
+            </w:pPr>
+            <w:r>
+              <w:t xml:space="preserve">period</w:t>
+            </w:r>
+          </w:p>
+        </w:tc>
+        <w:tc>
+          <w:tcPr/>
+          <w:p>
+            <w:pPr>
+              <w:pStyle w:val="Compact"/>
+              <w:jc w:val="right"/>
+            </w:pPr>
+            <w:r>
+              <w:t xml:space="preserve">0.97</w:t>
+            </w:r>
+          </w:p>
+        </w:tc>
+        <w:tc>
+          <w:tcPr/>
+          <w:p>
+            <w:pPr>
+              <w:pStyle w:val="Compact"/>
+              <w:jc w:val="right"/>
+            </w:pPr>
+            <w:r>
+              <w:t xml:space="preserve">0.91</w:t>
+            </w:r>
+          </w:p>
+        </w:tc>
+        <w:tc>
+          <w:tcPr/>
+          <w:p>
+            <w:pPr>
+              <w:pStyle w:val="Compact"/>
+              <w:jc w:val="right"/>
+            </w:pPr>
+            <w:r>
+              <w:t xml:space="preserve">1.03</w:t>
+            </w:r>
+          </w:p>
+        </w:tc>
+      </w:tr>
+      <w:tr>
+        <w:tc>
+          <w:tcPr/>
+          <w:p>
+            <w:pPr>
+              <w:pStyle w:val="Compact"/>
+            </w:pPr>
+            <w:r>
+              <w:t xml:space="preserve">period</w:t>
+            </w:r>
+          </w:p>
+        </w:tc>
+        <w:tc>
+          <w:tcPr/>
+          <w:p>
+            <w:pPr>
+              <w:pStyle w:val="Compact"/>
+              <w:jc w:val="right"/>
+            </w:pPr>
+            <w:r>
+              <w:t xml:space="preserve">L to N</w:t>
+            </w:r>
+          </w:p>
+        </w:tc>
+        <w:tc>
+          <w:tcPr/>
+          <w:p>
+            <w:pPr>
+              <w:pStyle w:val="Compact"/>
+              <w:jc w:val="right"/>
+            </w:pPr>
+            <w:r>
+              <w:t xml:space="preserve">period</w:t>
+            </w:r>
+          </w:p>
+        </w:tc>
+        <w:tc>
+          <w:tcPr/>
+          <w:p>
+            <w:pPr>
+              <w:pStyle w:val="Compact"/>
+              <w:jc w:val="right"/>
+            </w:pPr>
+            <w:r>
+              <w:t xml:space="preserve">0.67</w:t>
+            </w:r>
+          </w:p>
+        </w:tc>
+        <w:tc>
+          <w:tcPr/>
+          <w:p>
+            <w:pPr>
+              <w:pStyle w:val="Compact"/>
+              <w:jc w:val="right"/>
+            </w:pPr>
+            <w:r>
+              <w:t xml:space="preserve">0.58</w:t>
+            </w:r>
+          </w:p>
+        </w:tc>
+        <w:tc>
+          <w:tcPr/>
+          <w:p>
+            <w:pPr>
+              <w:pStyle w:val="Compact"/>
+              <w:jc w:val="right"/>
+            </w:pPr>
+            <w:r>
+              <w:t xml:space="preserve">0.78</w:t>
+            </w:r>
+          </w:p>
+        </w:tc>
+      </w:tr>
+      <w:tr>
+        <w:tc>
+          <w:tcPr/>
+          <w:p>
+            <w:pPr>
+              <w:pStyle w:val="Compact"/>
+            </w:pPr>
+            <w:r>
+              <w:t xml:space="preserve">period</w:t>
+            </w:r>
+          </w:p>
+        </w:tc>
+        <w:tc>
+          <w:tcPr/>
+          <w:p>
+            <w:pPr>
+              <w:pStyle w:val="Compact"/>
+              <w:jc w:val="right"/>
+            </w:pPr>
+            <w:r>
+              <w:t xml:space="preserve">L to X</w:t>
+            </w:r>
+          </w:p>
+        </w:tc>
+        <w:tc>
+          <w:tcPr/>
+          <w:p>
+            <w:pPr>
+              <w:pStyle w:val="Compact"/>
+              <w:jc w:val="right"/>
+            </w:pPr>
+            <w:r>
+              <w:t xml:space="preserve">period</w:t>
+            </w:r>
+          </w:p>
+        </w:tc>
+        <w:tc>
+          <w:tcPr/>
+          <w:p>
+            <w:pPr>
+              <w:pStyle w:val="Compact"/>
+              <w:jc w:val="right"/>
+            </w:pPr>
+            <w:r>
+              <w:t xml:space="preserve">1.06</w:t>
+            </w:r>
+          </w:p>
+        </w:tc>
+        <w:tc>
+          <w:tcPr/>
+          <w:p>
+            <w:pPr>
+              <w:pStyle w:val="Compact"/>
+              <w:jc w:val="right"/>
+            </w:pPr>
+            <w:r>
+              <w:t xml:space="preserve">0.99</w:t>
+            </w:r>
+          </w:p>
+        </w:tc>
+        <w:tc>
+          <w:tcPr/>
+          <w:p>
+            <w:pPr>
+              <w:pStyle w:val="Compact"/>
+              <w:jc w:val="right"/>
+            </w:pPr>
+            <w:r>
+              <w:t xml:space="preserve">1.14</w:t>
+            </w:r>
+          </w:p>
+        </w:tc>
+      </w:tr>
+      <w:tr>
+        <w:tc>
+          <w:tcPr/>
+          <w:p>
+            <w:pPr>
+              <w:pStyle w:val="Compact"/>
+            </w:pPr>
+            <w:r>
+              <w:t xml:space="preserve">period</w:t>
+            </w:r>
+          </w:p>
+        </w:tc>
+        <w:tc>
+          <w:tcPr/>
+          <w:p>
+            <w:pPr>
+              <w:pStyle w:val="Compact"/>
+              <w:jc w:val="right"/>
+            </w:pPr>
+            <w:r>
+              <w:t xml:space="preserve">N to D</w:t>
+            </w:r>
+          </w:p>
+        </w:tc>
+        <w:tc>
+          <w:tcPr/>
+          <w:p>
+            <w:pPr>
+              <w:pStyle w:val="Compact"/>
+              <w:jc w:val="right"/>
+            </w:pPr>
+            <w:r>
+              <w:t xml:space="preserve">period</w:t>
+            </w:r>
+          </w:p>
+        </w:tc>
+        <w:tc>
+          <w:tcPr/>
+          <w:p>
+            <w:pPr>
+              <w:pStyle w:val="Compact"/>
+              <w:jc w:val="right"/>
+            </w:pPr>
+            <w:r>
+              <w:t xml:space="preserve">1.20</w:t>
+            </w:r>
+          </w:p>
+        </w:tc>
+        <w:tc>
+          <w:tcPr/>
+          <w:p>
+            <w:pPr>
+              <w:pStyle w:val="Compact"/>
+              <w:jc w:val="right"/>
+            </w:pPr>
+            <w:r>
+              <w:t xml:space="preserve">0.90</w:t>
+            </w:r>
+          </w:p>
+        </w:tc>
+        <w:tc>
+          <w:tcPr/>
+          <w:p>
+            <w:pPr>
+              <w:pStyle w:val="Compact"/>
+              <w:jc w:val="right"/>
+            </w:pPr>
+            <w:r>
+              <w:t xml:space="preserve">1.60</w:t>
+            </w:r>
+          </w:p>
+        </w:tc>
+      </w:tr>
+      <w:tr>
+        <w:tc>
+          <w:tcPr/>
+          <w:p>
+            <w:pPr>
+              <w:pStyle w:val="Compact"/>
+            </w:pPr>
+            <w:r>
+              <w:t xml:space="preserve">period</w:t>
+            </w:r>
+          </w:p>
+        </w:tc>
+        <w:tc>
+          <w:tcPr/>
+          <w:p>
+            <w:pPr>
+              <w:pStyle w:val="Compact"/>
+              <w:jc w:val="right"/>
+            </w:pPr>
+            <w:r>
+              <w:t xml:space="preserve">N to L</w:t>
+            </w:r>
+          </w:p>
+        </w:tc>
+        <w:tc>
+          <w:tcPr/>
+          <w:p>
+            <w:pPr>
+              <w:pStyle w:val="Compact"/>
+              <w:jc w:val="right"/>
+            </w:pPr>
+            <w:r>
+              <w:t xml:space="preserve">period</w:t>
+            </w:r>
+          </w:p>
+        </w:tc>
+        <w:tc>
+          <w:tcPr/>
+          <w:p>
+            <w:pPr>
+              <w:pStyle w:val="Compact"/>
+              <w:jc w:val="right"/>
+            </w:pPr>
+            <w:r>
+              <w:t xml:space="preserve">1.64</w:t>
+            </w:r>
+          </w:p>
+        </w:tc>
+        <w:tc>
+          <w:tcPr/>
+          <w:p>
+            <w:pPr>
+              <w:pStyle w:val="Compact"/>
+              <w:jc w:val="right"/>
+            </w:pPr>
+            <w:r>
+              <w:t xml:space="preserve">0.91</w:t>
+            </w:r>
+          </w:p>
+        </w:tc>
+        <w:tc>
+          <w:tcPr/>
+          <w:p>
+            <w:pPr>
+              <w:pStyle w:val="Compact"/>
+              <w:jc w:val="right"/>
+            </w:pPr>
+            <w:r>
+              <w:t xml:space="preserve">2.93</w:t>
+            </w:r>
+          </w:p>
+        </w:tc>
+      </w:tr>
+      <w:tr>
+        <w:tc>
+          <w:tcPr/>
+          <w:p>
+            <w:pPr>
+              <w:pStyle w:val="Compact"/>
+            </w:pPr>
+            <w:r>
+              <w:t xml:space="preserve">period</w:t>
+            </w:r>
+          </w:p>
+        </w:tc>
+        <w:tc>
+          <w:tcPr/>
+          <w:p>
+            <w:pPr>
+              <w:pStyle w:val="Compact"/>
+              <w:jc w:val="right"/>
+            </w:pPr>
+            <w:r>
+              <w:t xml:space="preserve">N to X</w:t>
+            </w:r>
+          </w:p>
+        </w:tc>
+        <w:tc>
+          <w:tcPr/>
+          <w:p>
+            <w:pPr>
+              <w:pStyle w:val="Compact"/>
+              <w:jc w:val="right"/>
+            </w:pPr>
+            <w:r>
+              <w:t xml:space="preserve">period</w:t>
+            </w:r>
+          </w:p>
+        </w:tc>
+        <w:tc>
+          <w:tcPr/>
+          <w:p>
+            <w:pPr>
+              <w:pStyle w:val="Compact"/>
+              <w:jc w:val="right"/>
+            </w:pPr>
+            <w:r>
+              <w:t xml:space="preserve">1.07</w:t>
+            </w:r>
+          </w:p>
+        </w:tc>
+        <w:tc>
+          <w:tcPr/>
+          <w:p>
+            <w:pPr>
+              <w:pStyle w:val="Compact"/>
+              <w:jc w:val="right"/>
+            </w:pPr>
+            <w:r>
+              <w:t xml:space="preserve">1.00</w:t>
+            </w:r>
+          </w:p>
+        </w:tc>
+        <w:tc>
+          <w:tcPr/>
+          <w:p>
+            <w:pPr>
+              <w:pStyle w:val="Compact"/>
+              <w:jc w:val="right"/>
+            </w:pPr>
+            <w:r>
+              <w:t xml:space="preserve">1.15</w:t>
             </w:r>
           </w:p>
         </w:tc>

</xml_diff>

<commit_message>
Income extension re-estimated to convergence; quadratic age withdrawn
The income fit converges from the warm start with the same estimates
(largest hazard-ratio change 0.10) and is reported on 36 degrees of
freedom. The quadratic-age extension had not converged after 29 hours
and is not reported.
</commit_message>
<xml_diff>
--- a/manuscript/Paper5_Babalola.docx
+++ b/manuscript/Paper5_Babalola.docx
@@ -59,7 +59,7 @@
         <w:t xml:space="preserve"> </w:t>
       </w:r>
       <w:r>
-        <w:t xml:space="preserve">7,589 excluding abstract, tables, figure captions and references.</w:t>
+        <w:t xml:space="preserve">7,663 excluding abstract, tables, figure captions and references.</w:t>
       </w:r>
     </w:p>
     <w:p>
@@ -3330,7 +3330,7 @@
         <w:pStyle w:val="FirstParagraph"/>
       </w:pPr>
       <w:r>
-        <w:t xml:space="preserve">Table A1 reports extensions that add a term to every one of the 18 intensities of the full model and test it by likelihood ratio. Each starts from the main model’s estimates with the new terms at zero, and the table records whether the optimizer converged.</w:t>
+        <w:t xml:space="preserve">Table A1 reports extensions that add a term to every one of the 18 intensities of the full model and test it by likelihood ratio. Each starts from the main model’s estimates with the new terms at zero, and the table records whether the optimizer converged. Three are reported. A fourth, a quadratic in age on top of the spline, is not: the first attempt built the term from age at the interval midpoint, which for a death row carries the date of death, and the re-estimation with age at the start of the interval had not converged after 29 hours and was stopped. The spline already lets the intensities bend at 70 and 85, so little rests on it.</w:t>
       </w:r>
     </w:p>
     <w:p>
@@ -3348,7 +3348,7 @@
         <w:t xml:space="preserve"> </w:t>
       </w:r>
       <w:r>
-        <w:t xml:space="preserve">Adding indicators for the lowest and highest tertile of household income improves the likelihood by 1,789.6 on 36 degrees of freedom. Low income raises the intensity of moving from H to D (hazard ratio 1.72), from C to D (1.43), from C to a nursing home (1.66) and from C to death (1.41); high income lowers the last two to 1.19 and 0.73. The effect on life expectancy is large: starting from chronic illness at 65, a man in the lowest tertile can expect 13.9 years and one in the highest 18.6, and a woman 17.5 against 22.2. The main model has no income term, so its income results in Section 6.5 carry differences in composition, costs and Medicaid but not in health dynamics, and the 2-year gap in life expectancy they show is less than half of the 4.7 years this extension implies.</w:t>
+        <w:t xml:space="preserve">Adding indicators for the lowest and highest tertile of household income improves the likelihood by 1,789.7 on 36 degrees of freedom. Low income raises the intensity of moving from H to D (hazard ratio 1.72), from C to D (1.43), from C to a nursing home (1.66) and from C to death (1.41); high income lowers the last two to 1.19 and 0.73. The effect on life expectancy is large: starting from chronic illness at 65, a man in the lowest tertile can expect 13.9 years and one in the highest 18.6, and a woman 17.5 against 22.2. The main model has no income term, so its income results in Section 6.5 carry differences in composition, costs and Medicaid but not in health dynamics, and the 2-year gap in life expectancy they show is less than half of the 4.7 years this extension implies.</w:t>
       </w:r>
     </w:p>
     <w:p>
@@ -41878,7 +41878,7 @@
               <w:jc w:val="right"/>
             </w:pPr>
             <w:r>
-              <w:t xml:space="preserve">1,789.6</w:t>
+              <w:t xml:space="preserve">1,789.7</w:t>
             </w:r>
           </w:p>
         </w:tc>
@@ -42384,7 +42384,7 @@
               <w:jc w:val="right"/>
             </w:pPr>
             <w:r>
-              <w:t xml:space="preserve">2.21</w:t>
+              <w:t xml:space="preserve">2.20</w:t>
             </w:r>
           </w:p>
         </w:tc>
@@ -42445,7 +42445,7 @@
               <w:jc w:val="right"/>
             </w:pPr>
             <w:r>
-              <w:t xml:space="preserve">0.35</w:t>
+              <w:t xml:space="preserve">0.34</w:t>
             </w:r>
           </w:p>
         </w:tc>
@@ -42652,31 +42652,31 @@
               <w:jc w:val="right"/>
             </w:pPr>
             <w:r>
-              <w:t xml:space="preserve">12.68</w:t>
-            </w:r>
-          </w:p>
-        </w:tc>
-        <w:tc>
-          <w:tcPr/>
-          <w:p>
-            <w:pPr>
-              <w:pStyle w:val="Compact"/>
-              <w:jc w:val="right"/>
-            </w:pPr>
-            <w:r>
-              <w:t xml:space="preserve">1.03</w:t>
-            </w:r>
-          </w:p>
-        </w:tc>
-        <w:tc>
-          <w:tcPr/>
-          <w:p>
-            <w:pPr>
-              <w:pStyle w:val="Compact"/>
-              <w:jc w:val="right"/>
-            </w:pPr>
-            <w:r>
-              <w:t xml:space="preserve">156.28</w:t>
+              <w:t xml:space="preserve">12.59</w:t>
+            </w:r>
+          </w:p>
+        </w:tc>
+        <w:tc>
+          <w:tcPr/>
+          <w:p>
+            <w:pPr>
+              <w:pStyle w:val="Compact"/>
+              <w:jc w:val="right"/>
+            </w:pPr>
+            <w:r>
+              <w:t xml:space="preserve">1.07</w:t>
+            </w:r>
+          </w:p>
+        </w:tc>
+        <w:tc>
+          <w:tcPr/>
+          <w:p>
+            <w:pPr>
+              <w:pStyle w:val="Compact"/>
+              <w:jc w:val="right"/>
+            </w:pPr>
+            <w:r>
+              <w:t xml:space="preserve">148.23</w:t>
             </w:r>
           </w:p>
         </w:tc>
@@ -42725,18 +42725,6 @@
               <w:jc w:val="right"/>
             </w:pPr>
             <w:r>
-              <w:t xml:space="preserve">0.01</w:t>
-            </w:r>
-          </w:p>
-        </w:tc>
-        <w:tc>
-          <w:tcPr/>
-          <w:p>
-            <w:pPr>
-              <w:pStyle w:val="Compact"/>
-              <w:jc w:val="right"/>
-            </w:pPr>
-            <w:r>
               <w:t xml:space="preserve">0.00</w:t>
             </w:r>
           </w:p>
@@ -42749,7 +42737,19 @@
               <w:jc w:val="right"/>
             </w:pPr>
             <w:r>
-              <w:t xml:space="preserve">7,270.80</w:t>
+              <w:t xml:space="preserve">0.00</w:t>
+            </w:r>
+          </w:p>
+        </w:tc>
+        <w:tc>
+          <w:tcPr/>
+          <w:p>
+            <w:pPr>
+              <w:pStyle w:val="Compact"/>
+              <w:jc w:val="right"/>
+            </w:pPr>
+            <w:r>
+              <w:t xml:space="preserve">2,888,720.28</w:t>
             </w:r>
           </w:p>
         </w:tc>
@@ -42822,7 +42822,7 @@
               <w:jc w:val="right"/>
             </w:pPr>
             <w:r>
-              <w:t xml:space="preserve">2.22</w:t>
+              <w:t xml:space="preserve">2.21</w:t>
             </w:r>
           </w:p>
         </w:tc>
@@ -43187,7 +43187,7 @@
               <w:jc w:val="right"/>
             </w:pPr>
             <w:r>
-              <w:t xml:space="preserve">1.83</w:t>
+              <w:t xml:space="preserve">1.84</w:t>
             </w:r>
           </w:p>
         </w:tc>
@@ -44039,7 +44039,7 @@
               <w:jc w:val="right"/>
             </w:pPr>
             <w:r>
-              <w:t xml:space="preserve">0.85</w:t>
+              <w:t xml:space="preserve">0.84</w:t>
             </w:r>
           </w:p>
         </w:tc>
@@ -44404,7 +44404,7 @@
               <w:jc w:val="right"/>
             </w:pPr>
             <w:r>
-              <w:t xml:space="preserve">0.88</w:t>
+              <w:t xml:space="preserve">0.87</w:t>
             </w:r>
           </w:p>
         </w:tc>
@@ -44428,7 +44428,7 @@
               <w:jc w:val="right"/>
             </w:pPr>
             <w:r>
-              <w:t xml:space="preserve">1.61</w:t>
+              <w:t xml:space="preserve">1.60</w:t>
             </w:r>
           </w:p>
         </w:tc>
@@ -44477,31 +44477,31 @@
               <w:jc w:val="right"/>
             </w:pPr>
             <w:r>
-              <w:t xml:space="preserve">1.28</w:t>
-            </w:r>
-          </w:p>
-        </w:tc>
-        <w:tc>
-          <w:tcPr/>
-          <w:p>
-            <w:pPr>
-              <w:pStyle w:val="Compact"/>
-              <w:jc w:val="right"/>
-            </w:pPr>
-            <w:r>
-              <w:t xml:space="preserve">0.55</w:t>
-            </w:r>
-          </w:p>
-        </w:tc>
-        <w:tc>
-          <w:tcPr/>
-          <w:p>
-            <w:pPr>
-              <w:pStyle w:val="Compact"/>
-              <w:jc w:val="right"/>
-            </w:pPr>
-            <w:r>
-              <w:t xml:space="preserve">2.99</w:t>
+              <w:t xml:space="preserve">1.27</w:t>
+            </w:r>
+          </w:p>
+        </w:tc>
+        <w:tc>
+          <w:tcPr/>
+          <w:p>
+            <w:pPr>
+              <w:pStyle w:val="Compact"/>
+              <w:jc w:val="right"/>
+            </w:pPr>
+            <w:r>
+              <w:t xml:space="preserve">0.54</w:t>
+            </w:r>
+          </w:p>
+        </w:tc>
+        <w:tc>
+          <w:tcPr/>
+          <w:p>
+            <w:pPr>
+              <w:pStyle w:val="Compact"/>
+              <w:jc w:val="right"/>
+            </w:pPr>
+            <w:r>
+              <w:t xml:space="preserve">2.97</w:t>
             </w:r>
           </w:p>
         </w:tc>

</xml_diff>